<commit_message>
Add general, peer-reviewed sources to the reference list
Co-Authored-By: Claude Opus 5.5 <noreply@anthropic.com>
Claude-Session: https://claude.ai/code/session_01TVDSUwiDsz6ih48fHzExXj
</commit_message>
<xml_diff>
--- a/References.docx
+++ b/References.docx
@@ -22,6 +22,41 @@
         <w:rPr>
           <w:i w:val="0"/>
         </w:rPr>
+        <w:t xml:space="preserve">Bettinger, E. P., &amp; Baker, R. B. (2014). The effects of student coaching: An evaluation of a randomized experiment in student advising. </w:t>
+      </w:r>
+      <w:r>
+        <w:rPr>
+          <w:i/>
+        </w:rPr>
+        <w:t>Educational Evaluation and Policy Analysis, 36</w:t>
+      </w:r>
+      <w:r>
+        <w:rPr>
+          <w:i w:val="0"/>
+        </w:rPr>
+        <w:t xml:space="preserve">(1), 3–19. </w:t>
+      </w:r>
+      <w:hyperlink r:id="rId9">
+        <w:r>
+          <w:rPr>
+            <w:rFonts w:ascii="Times New Roman" w:hAnsi="Times New Roman" w:cs="Times New Roman"/>
+            <w:color w:val="0563C1"/>
+            <w:u w:val="single"/>
+            <w:sz w:val="24"/>
+          </w:rPr>
+          <w:t>https://doi.org/10.3102/0162373713500523</w:t>
+        </w:r>
+      </w:hyperlink>
+    </w:p>
+    <w:p>
+      <w:pPr>
+        <w:spacing w:line="480" w:lineRule="auto" w:after="0"/>
+        <w:ind w:left="720" w:hanging="720"/>
+      </w:pPr>
+      <w:r>
+        <w:rPr>
+          <w:i w:val="0"/>
+        </w:rPr>
         <w:t xml:space="preserve">Betz, N. E., Klein, K. L., &amp; Taylor, K. M. (1996). Evaluation of a short form of the Career Decision-Making Self-Efficacy Scale. </w:t>
       </w:r>
       <w:r>
@@ -36,7 +71,7 @@
         </w:rPr>
         <w:t xml:space="preserve">(1), 47–57. </w:t>
       </w:r>
-      <w:hyperlink r:id="rId9">
+      <w:hyperlink r:id="rId10">
         <w:r>
           <w:rPr>
             <w:rFonts w:ascii="Times New Roman" w:hAnsi="Times New Roman" w:cs="Times New Roman"/>
@@ -45,41 +80,6 @@
             <w:sz w:val="24"/>
           </w:rPr>
           <w:t>https://doi.org/10.1177/106907279600400103</w:t>
-        </w:r>
-      </w:hyperlink>
-    </w:p>
-    <w:p>
-      <w:pPr>
-        <w:spacing w:line="480" w:lineRule="auto" w:after="0"/>
-        <w:ind w:left="720" w:hanging="720"/>
-      </w:pPr>
-      <w:r>
-        <w:rPr>
-          <w:i w:val="0"/>
-        </w:rPr>
-        <w:t xml:space="preserve">Bettinger, E. P., &amp; Baker, R. B. (2014). The effects of student coaching: An evaluation of a randomized experiment in student advising. </w:t>
-      </w:r>
-      <w:r>
-        <w:rPr>
-          <w:i/>
-        </w:rPr>
-        <w:t>Educational Evaluation and Policy Analysis, 36</w:t>
-      </w:r>
-      <w:r>
-        <w:rPr>
-          <w:i w:val="0"/>
-        </w:rPr>
-        <w:t xml:space="preserve">(1), 3–19. </w:t>
-      </w:r>
-      <w:hyperlink r:id="rId10">
-        <w:r>
-          <w:rPr>
-            <w:rFonts w:ascii="Times New Roman" w:hAnsi="Times New Roman" w:cs="Times New Roman"/>
-            <w:color w:val="0563C1"/>
-            <w:u w:val="single"/>
-            <w:sz w:val="24"/>
-          </w:rPr>
-          <w:t>https://doi.org/10.3102/0162373713500523</w:t>
         </w:r>
       </w:hyperlink>
     </w:p>
@@ -151,6 +151,41 @@
         <w:rPr>
           <w:i w:val="0"/>
         </w:rPr>
+        <w:t xml:space="preserve">Cataldi, E. F., Bennett, C. T., &amp; Chen, X. (2018). </w:t>
+      </w:r>
+      <w:r>
+        <w:rPr>
+          <w:i/>
+        </w:rPr>
+        <w:t>First-generation students: College access, persistence, and postbachelor’s outcomes</w:t>
+      </w:r>
+      <w:r>
+        <w:rPr>
+          <w:i w:val="0"/>
+        </w:rPr>
+        <w:t xml:space="preserve"> (NCES 2018-421). U.S. Department of Education, National Center for Education Statistics. </w:t>
+      </w:r>
+      <w:hyperlink r:id="rId12">
+        <w:r>
+          <w:rPr>
+            <w:rFonts w:ascii="Times New Roman" w:hAnsi="Times New Roman" w:cs="Times New Roman"/>
+            <w:color w:val="0563C1"/>
+            <w:u w:val="single"/>
+            <w:sz w:val="24"/>
+          </w:rPr>
+          <w:t>https://nces.ed.gov/pubs2018/2018421.pdf</w:t>
+        </w:r>
+      </w:hyperlink>
+    </w:p>
+    <w:p>
+      <w:pPr>
+        <w:spacing w:line="480" w:lineRule="auto" w:after="0"/>
+        <w:ind w:left="720" w:hanging="720"/>
+      </w:pPr>
+      <w:r>
+        <w:rPr>
+          <w:i w:val="0"/>
+        </w:rPr>
         <w:t xml:space="preserve">Daugherty, L., Johnston, W. R., &amp; Berglund, T. (2020). </w:t>
       </w:r>
       <w:r>
@@ -165,7 +200,7 @@
         </w:rPr>
         <w:t xml:space="preserve">. RAND Corporation. </w:t>
       </w:r>
-      <w:hyperlink r:id="rId12">
+      <w:hyperlink r:id="rId13">
         <w:r>
           <w:rPr>
             <w:rFonts w:ascii="Times New Roman" w:hAnsi="Times New Roman" w:cs="Times New Roman"/>
@@ -200,7 +235,7 @@
         </w:rPr>
         <w:t xml:space="preserve">(1), 133–156. </w:t>
       </w:r>
-      <w:hyperlink r:id="rId13">
+      <w:hyperlink r:id="rId14">
         <w:r>
           <w:rPr>
             <w:rFonts w:ascii="Times New Roman" w:hAnsi="Times New Roman" w:cs="Times New Roman"/>
@@ -209,6 +244,41 @@
             <w:sz w:val="24"/>
           </w:rPr>
           <w:t>https://doi.org/10.1080/13639080020028747</w:t>
+        </w:r>
+      </w:hyperlink>
+    </w:p>
+    <w:p>
+      <w:pPr>
+        <w:spacing w:line="480" w:lineRule="auto" w:after="0"/>
+        <w:ind w:left="720" w:hanging="720"/>
+      </w:pPr>
+      <w:r>
+        <w:rPr>
+          <w:i w:val="0"/>
+        </w:rPr>
+        <w:t xml:space="preserve">Evans, W. N., Kearney, M. S., Perry, B., &amp; Sullivan, J. X. (2020). Increasing community college completion rates among low-income students: Evidence from a randomized controlled trial evaluation of a case-management intervention. </w:t>
+      </w:r>
+      <w:r>
+        <w:rPr>
+          <w:i/>
+        </w:rPr>
+        <w:t>Journal of Policy Analysis and Management, 39</w:t>
+      </w:r>
+      <w:r>
+        <w:rPr>
+          <w:i w:val="0"/>
+        </w:rPr>
+        <w:t xml:space="preserve">(4), 930–965. </w:t>
+      </w:r>
+      <w:hyperlink r:id="rId15">
+        <w:r>
+          <w:rPr>
+            <w:rFonts w:ascii="Times New Roman" w:hAnsi="Times New Roman" w:cs="Times New Roman"/>
+            <w:color w:val="0563C1"/>
+            <w:u w:val="single"/>
+            <w:sz w:val="24"/>
+          </w:rPr>
+          <w:t>https://doi.org/10.1002/pam.22256</w:t>
         </w:r>
       </w:hyperlink>
     </w:p>
@@ -235,7 +305,7 @@
         </w:rPr>
         <w:t xml:space="preserve"> [Working paper]. University of Chicago Inclusive Economy Lab. </w:t>
       </w:r>
-      <w:hyperlink r:id="rId14">
+      <w:hyperlink r:id="rId16">
         <w:r>
           <w:rPr>
             <w:rFonts w:ascii="Times New Roman" w:hAnsi="Times New Roman" w:cs="Times New Roman"/>
@@ -270,7 +340,7 @@
         </w:rPr>
         <w:t xml:space="preserve">. Strada Institute for the Future of Work and Burning Glass Institute. </w:t>
       </w:r>
-      <w:hyperlink r:id="rId15">
+      <w:hyperlink r:id="rId17">
         <w:r>
           <w:rPr>
             <w:rFonts w:ascii="Times New Roman" w:hAnsi="Times New Roman" w:cs="Times New Roman"/>
@@ -305,7 +375,7 @@
         </w:rPr>
         <w:t xml:space="preserve">(3), 227–256. </w:t>
       </w:r>
-      <w:hyperlink r:id="rId16">
+      <w:hyperlink r:id="rId18">
         <w:r>
           <w:rPr>
             <w:rFonts w:ascii="Times New Roman" w:hAnsi="Times New Roman" w:cs="Times New Roman"/>
@@ -314,6 +384,41 @@
             <w:sz w:val="24"/>
           </w:rPr>
           <w:t>https://doi.org/10.2190/DRYC-CXQ9-JQ8V-HT4V</w:t>
+        </w:r>
+      </w:hyperlink>
+    </w:p>
+    <w:p>
+      <w:pPr>
+        <w:spacing w:line="480" w:lineRule="auto" w:after="0"/>
+        <w:ind w:left="720" w:hanging="720"/>
+      </w:pPr>
+      <w:r>
+        <w:rPr>
+          <w:i w:val="0"/>
+        </w:rPr>
+        <w:t xml:space="preserve">Hora, M. T., Chen, Z., Parrott, E., &amp; Her, P. (2019). </w:t>
+      </w:r>
+      <w:r>
+        <w:rPr>
+          <w:i/>
+        </w:rPr>
+        <w:t>Problematizing college internships: Exploring issues with access, program design and developmental outcomes in three U.S. colleges</w:t>
+      </w:r>
+      <w:r>
+        <w:rPr>
+          <w:i w:val="0"/>
+        </w:rPr>
+        <w:t xml:space="preserve"> (WCER Working Paper No. 2019-1). Wisconsin Center for Education Research, University of Wisconsin–Madison. </w:t>
+      </w:r>
+      <w:hyperlink r:id="rId19">
+        <w:r>
+          <w:rPr>
+            <w:rFonts w:ascii="Times New Roman" w:hAnsi="Times New Roman" w:cs="Times New Roman"/>
+            <w:color w:val="0563C1"/>
+            <w:u w:val="single"/>
+            <w:sz w:val="24"/>
+          </w:rPr>
+          <w:t>https://ccwt.wisc.edu/publication/problematizing-college-internships-exploring-issues-with-access-program-design-and-developmental-outcomes-in-three-u-s-colleges-wcer-working-paper-no-2019-1/</w:t>
         </w:r>
       </w:hyperlink>
     </w:p>
@@ -340,7 +445,7 @@
         </w:rPr>
         <w:t xml:space="preserve">. </w:t>
       </w:r>
-      <w:hyperlink r:id="rId17">
+      <w:hyperlink r:id="rId20">
         <w:r>
           <w:rPr>
             <w:rFonts w:ascii="Times New Roman" w:hAnsi="Times New Roman" w:cs="Times New Roman"/>
@@ -375,7 +480,7 @@
         </w:rPr>
         <w:t xml:space="preserve">. </w:t>
       </w:r>
-      <w:hyperlink r:id="rId18">
+      <w:hyperlink r:id="rId21">
         <w:r>
           <w:rPr>
             <w:rFonts w:ascii="Times New Roman" w:hAnsi="Times New Roman" w:cs="Times New Roman"/>
@@ -410,7 +515,7 @@
         </w:rPr>
         <w:t xml:space="preserve">. </w:t>
       </w:r>
-      <w:hyperlink r:id="rId19">
+      <w:hyperlink r:id="rId22">
         <w:r>
           <w:rPr>
             <w:rFonts w:ascii="Times New Roman" w:hAnsi="Times New Roman" w:cs="Times New Roman"/>
@@ -419,111 +524,6 @@
             <w:sz w:val="24"/>
           </w:rPr>
           <w:t>https://iit.edu/sites/default/files/2024-06/Full-2023-2024-Common-Data-Set.pdf</w:t>
-        </w:r>
-      </w:hyperlink>
-    </w:p>
-    <w:p>
-      <w:pPr>
-        <w:spacing w:line="480" w:lineRule="auto" w:after="0"/>
-        <w:ind w:left="720" w:hanging="720"/>
-      </w:pPr>
-      <w:r>
-        <w:rPr>
-          <w:i w:val="0"/>
-        </w:rPr>
-        <w:t xml:space="preserve">Logan, F. (2026). </w:t>
-      </w:r>
-      <w:r>
-        <w:rPr>
-          <w:i/>
-        </w:rPr>
-        <w:t>How do technology professionals engage in distributed work? An activity systems analysis in corporate and educational organizations</w:t>
-      </w:r>
-      <w:r>
-        <w:rPr>
-          <w:i w:val="0"/>
-        </w:rPr>
-        <w:t xml:space="preserve"> [Doctoral thesis, Lancaster University]. </w:t>
-      </w:r>
-      <w:hyperlink r:id="rId20">
-        <w:r>
-          <w:rPr>
-            <w:rFonts w:ascii="Times New Roman" w:hAnsi="Times New Roman" w:cs="Times New Roman"/>
-            <w:color w:val="0563C1"/>
-            <w:u w:val="single"/>
-            <w:sz w:val="24"/>
-          </w:rPr>
-          <w:t>https://research.lancaster-university.uk/en/publications/how-do-technology-professionals-engage-in-distributed-work-an-act/</w:t>
-        </w:r>
-      </w:hyperlink>
-    </w:p>
-    <w:p>
-      <w:pPr>
-        <w:spacing w:line="480" w:lineRule="auto" w:after="0"/>
-        <w:ind w:left="720" w:hanging="720"/>
-      </w:pPr>
-      <w:r>
-        <w:rPr>
-          <w:i w:val="0"/>
-        </w:rPr>
-        <w:t xml:space="preserve">Perez, R. J., &amp; Kezar, A. (2025). Ecological validation: A complementary approach to supporting minoritized student success. </w:t>
-      </w:r>
-      <w:r>
-        <w:rPr>
-          <w:i/>
-        </w:rPr>
-        <w:t>Journal of Postsecondary Student Success, 4</w:t>
-      </w:r>
-      <w:r>
-        <w:rPr>
-          <w:i w:val="0"/>
-        </w:rPr>
-        <w:t xml:space="preserve">(4), 1–15. </w:t>
-      </w:r>
-      <w:hyperlink r:id="rId21">
-        <w:r>
-          <w:rPr>
-            <w:rFonts w:ascii="Times New Roman" w:hAnsi="Times New Roman" w:cs="Times New Roman"/>
-            <w:color w:val="0563C1"/>
-            <w:u w:val="single"/>
-            <w:sz w:val="24"/>
-          </w:rPr>
-          <w:t>https://doi.org/10.33009/fsop_jpss135324</w:t>
-        </w:r>
-      </w:hyperlink>
-    </w:p>
-    <w:p>
-      <w:pPr>
-        <w:spacing w:line="480" w:lineRule="auto" w:after="0"/>
-        <w:ind w:left="720" w:hanging="720"/>
-      </w:pPr>
-      <w:r>
-        <w:rPr>
-          <w:i w:val="0"/>
-        </w:rPr>
-        <w:t xml:space="preserve">Rendón, L. I. (1994). Validating culturally diverse students: Toward a new model of learning and student development. </w:t>
-      </w:r>
-      <w:r>
-        <w:rPr>
-          <w:i/>
-        </w:rPr>
-        <w:t>Innovative Higher Education, 19</w:t>
-      </w:r>
-      <w:r>
-        <w:rPr>
-          <w:i w:val="0"/>
-        </w:rPr>
-        <w:t xml:space="preserve">(1), 33–51. </w:t>
-      </w:r>
-      <w:hyperlink r:id="rId22">
-        <w:r>
-          <w:rPr>
-            <w:rFonts w:ascii="Times New Roman" w:hAnsi="Times New Roman" w:cs="Times New Roman"/>
-            <w:color w:val="0563C1"/>
-            <w:u w:val="single"/>
-            <w:sz w:val="24"/>
-          </w:rPr>
-          <w:t>https://doi.org/10.1007/BF01191156</w:t>
         </w:r>
       </w:hyperlink>
     </w:p>
@@ -571,6 +571,334 @@
         <w:rPr>
           <w:i w:val="0"/>
         </w:rPr>
+        <w:t xml:space="preserve">Karp, M. M. (2016). A holistic conception of nonacademic support: How four mechanisms combine to encourage positive student outcomes in the community college. </w:t>
+      </w:r>
+      <w:r>
+        <w:rPr>
+          <w:i/>
+        </w:rPr>
+        <w:t>New Directions for Community Colleges, 2016</w:t>
+      </w:r>
+      <w:r>
+        <w:rPr>
+          <w:i w:val="0"/>
+        </w:rPr>
+        <w:t xml:space="preserve">(175), 33–44. </w:t>
+      </w:r>
+      <w:hyperlink r:id="rId24">
+        <w:r>
+          <w:rPr>
+            <w:rFonts w:ascii="Times New Roman" w:hAnsi="Times New Roman" w:cs="Times New Roman"/>
+            <w:color w:val="0563C1"/>
+            <w:u w:val="single"/>
+            <w:sz w:val="24"/>
+          </w:rPr>
+          <w:t>https://doi.org/10.1002/cc.20210</w:t>
+        </w:r>
+      </w:hyperlink>
+    </w:p>
+    <w:p>
+      <w:pPr>
+        <w:spacing w:line="480" w:lineRule="auto" w:after="0"/>
+        <w:ind w:left="720" w:hanging="720"/>
+      </w:pPr>
+      <w:r>
+        <w:rPr>
+          <w:i w:val="0"/>
+        </w:rPr>
+        <w:t xml:space="preserve">Kuh, G. D. (2008). </w:t>
+      </w:r>
+      <w:r>
+        <w:rPr>
+          <w:i/>
+        </w:rPr>
+        <w:t>High-impact educational practices: What they are, who has access to them, and why they matter</w:t>
+      </w:r>
+      <w:r>
+        <w:rPr>
+          <w:i w:val="0"/>
+        </w:rPr>
+        <w:t>. Association of American Colleges and Universities.</w:t>
+      </w:r>
+    </w:p>
+    <w:p>
+      <w:pPr>
+        <w:spacing w:line="480" w:lineRule="auto" w:after="0"/>
+        <w:ind w:left="720" w:hanging="720"/>
+      </w:pPr>
+      <w:r>
+        <w:rPr>
+          <w:i w:val="0"/>
+        </w:rPr>
+        <w:t xml:space="preserve">Logan, F. (2026). </w:t>
+      </w:r>
+      <w:r>
+        <w:rPr>
+          <w:i/>
+        </w:rPr>
+        <w:t>How do technology professionals engage in distributed work? An activity systems analysis in corporate and educational organizations</w:t>
+      </w:r>
+      <w:r>
+        <w:rPr>
+          <w:i w:val="0"/>
+        </w:rPr>
+        <w:t xml:space="preserve"> [Doctoral thesis, Lancaster University]. </w:t>
+      </w:r>
+      <w:hyperlink r:id="rId25">
+        <w:r>
+          <w:rPr>
+            <w:rFonts w:ascii="Times New Roman" w:hAnsi="Times New Roman" w:cs="Times New Roman"/>
+            <w:color w:val="0563C1"/>
+            <w:u w:val="single"/>
+            <w:sz w:val="24"/>
+          </w:rPr>
+          <w:t>https://research.lancaster-university.uk/en/publications/how-do-technology-professionals-engage-in-distributed-work-an-act/</w:t>
+        </w:r>
+      </w:hyperlink>
+    </w:p>
+    <w:p>
+      <w:pPr>
+        <w:spacing w:line="480" w:lineRule="auto" w:after="0"/>
+        <w:ind w:left="720" w:hanging="720"/>
+      </w:pPr>
+      <w:r>
+        <w:rPr>
+          <w:i w:val="0"/>
+        </w:rPr>
+        <w:t xml:space="preserve">Miller, C., &amp; Weiss, M. J. (2022). Increasing community college graduation rates: A synthesis of findings on the ASAP model from six colleges across two states. </w:t>
+      </w:r>
+      <w:r>
+        <w:rPr>
+          <w:i/>
+        </w:rPr>
+        <w:t>Educational Evaluation and Policy Analysis, 44</w:t>
+      </w:r>
+      <w:r>
+        <w:rPr>
+          <w:i w:val="0"/>
+        </w:rPr>
+        <w:t xml:space="preserve">(2), 210–233. </w:t>
+      </w:r>
+      <w:hyperlink r:id="rId26">
+        <w:r>
+          <w:rPr>
+            <w:rFonts w:ascii="Times New Roman" w:hAnsi="Times New Roman" w:cs="Times New Roman"/>
+            <w:color w:val="0563C1"/>
+            <w:u w:val="single"/>
+            <w:sz w:val="24"/>
+          </w:rPr>
+          <w:t>https://doi.org/10.3102/01623737211036726</w:t>
+        </w:r>
+      </w:hyperlink>
+    </w:p>
+    <w:p>
+      <w:pPr>
+        <w:spacing w:line="480" w:lineRule="auto" w:after="0"/>
+        <w:ind w:left="720" w:hanging="720"/>
+      </w:pPr>
+      <w:r>
+        <w:rPr>
+          <w:i w:val="0"/>
+        </w:rPr>
+        <w:t xml:space="preserve">National Association of Colleges and Employers. (n.d.). </w:t>
+      </w:r>
+      <w:r>
+        <w:rPr>
+          <w:i/>
+        </w:rPr>
+        <w:t>Career readiness defined</w:t>
+      </w:r>
+      <w:r>
+        <w:rPr>
+          <w:i w:val="0"/>
+        </w:rPr>
+        <w:t xml:space="preserve">. </w:t>
+      </w:r>
+      <w:hyperlink r:id="rId27">
+        <w:r>
+          <w:rPr>
+            <w:rFonts w:ascii="Times New Roman" w:hAnsi="Times New Roman" w:cs="Times New Roman"/>
+            <w:color w:val="0563C1"/>
+            <w:u w:val="single"/>
+            <w:sz w:val="24"/>
+          </w:rPr>
+          <w:t>https://www.naceweb.org/career-readiness/competencies/career-readiness-defined</w:t>
+        </w:r>
+      </w:hyperlink>
+    </w:p>
+    <w:p>
+      <w:pPr>
+        <w:spacing w:line="480" w:lineRule="auto" w:after="0"/>
+        <w:ind w:left="720" w:hanging="720"/>
+      </w:pPr>
+      <w:r>
+        <w:rPr>
+          <w:i w:val="0"/>
+        </w:rPr>
+        <w:t xml:space="preserve">Perez, R. J., &amp; Kezar, A. (2025). Ecological validation: A complementary approach to supporting minoritized student success. </w:t>
+      </w:r>
+      <w:r>
+        <w:rPr>
+          <w:i/>
+        </w:rPr>
+        <w:t>Journal of Postsecondary Student Success, 4</w:t>
+      </w:r>
+      <w:r>
+        <w:rPr>
+          <w:i w:val="0"/>
+        </w:rPr>
+        <w:t xml:space="preserve">(4), 1–15. </w:t>
+      </w:r>
+      <w:hyperlink r:id="rId28">
+        <w:r>
+          <w:rPr>
+            <w:rFonts w:ascii="Times New Roman" w:hAnsi="Times New Roman" w:cs="Times New Roman"/>
+            <w:color w:val="0563C1"/>
+            <w:u w:val="single"/>
+            <w:sz w:val="24"/>
+          </w:rPr>
+          <w:t>https://doi.org/10.33009/fsop_jpss135324</w:t>
+        </w:r>
+      </w:hyperlink>
+    </w:p>
+    <w:p>
+      <w:pPr>
+        <w:spacing w:line="480" w:lineRule="auto" w:after="0"/>
+        <w:ind w:left="720" w:hanging="720"/>
+      </w:pPr>
+      <w:r>
+        <w:rPr>
+          <w:i w:val="0"/>
+        </w:rPr>
+        <w:t xml:space="preserve">Rendón, L. I. (1994). Validating culturally diverse students: Toward a new model of learning and student development. </w:t>
+      </w:r>
+      <w:r>
+        <w:rPr>
+          <w:i/>
+        </w:rPr>
+        <w:t>Innovative Higher Education, 19</w:t>
+      </w:r>
+      <w:r>
+        <w:rPr>
+          <w:i w:val="0"/>
+        </w:rPr>
+        <w:t xml:space="preserve">(1), 33–51. </w:t>
+      </w:r>
+      <w:hyperlink r:id="rId29">
+        <w:r>
+          <w:rPr>
+            <w:rFonts w:ascii="Times New Roman" w:hAnsi="Times New Roman" w:cs="Times New Roman"/>
+            <w:color w:val="0563C1"/>
+            <w:u w:val="single"/>
+            <w:sz w:val="24"/>
+          </w:rPr>
+          <w:t>https://doi.org/10.1007/BF01191156</w:t>
+        </w:r>
+      </w:hyperlink>
+    </w:p>
+    <w:p>
+      <w:pPr>
+        <w:spacing w:line="480" w:lineRule="auto" w:after="0"/>
+        <w:ind w:left="720" w:hanging="720"/>
+      </w:pPr>
+      <w:r>
+        <w:rPr>
+          <w:i w:val="0"/>
+        </w:rPr>
+        <w:t xml:space="preserve">Strayhorn, T. L. (2019). </w:t>
+      </w:r>
+      <w:r>
+        <w:rPr>
+          <w:i/>
+        </w:rPr>
+        <w:t>College students’ sense of belonging: A key to educational success for all students</w:t>
+      </w:r>
+      <w:r>
+        <w:rPr>
+          <w:i w:val="0"/>
+        </w:rPr>
+        <w:t xml:space="preserve"> (2nd ed.). Routledge.</w:t>
+      </w:r>
+    </w:p>
+    <w:p>
+      <w:pPr>
+        <w:spacing w:line="480" w:lineRule="auto" w:after="0"/>
+        <w:ind w:left="720" w:hanging="720"/>
+      </w:pPr>
+      <w:r>
+        <w:rPr>
+          <w:i w:val="0"/>
+        </w:rPr>
+        <w:t xml:space="preserve">Tinto, V. (2012). </w:t>
+      </w:r>
+      <w:r>
+        <w:rPr>
+          <w:i/>
+        </w:rPr>
+        <w:t>Completing college: Rethinking institutional action</w:t>
+      </w:r>
+      <w:r>
+        <w:rPr>
+          <w:i w:val="0"/>
+        </w:rPr>
+        <w:t xml:space="preserve">. University of Chicago Press. </w:t>
+      </w:r>
+      <w:hyperlink r:id="rId30">
+        <w:r>
+          <w:rPr>
+            <w:rFonts w:ascii="Times New Roman" w:hAnsi="Times New Roman" w:cs="Times New Roman"/>
+            <w:color w:val="0563C1"/>
+            <w:u w:val="single"/>
+            <w:sz w:val="24"/>
+          </w:rPr>
+          <w:t>https://doi.org/10.7208/chicago/9780226804545.001.0001</w:t>
+        </w:r>
+      </w:hyperlink>
+    </w:p>
+    <w:p>
+      <w:pPr>
+        <w:spacing w:line="480" w:lineRule="auto" w:after="0"/>
+        <w:ind w:left="720" w:hanging="720"/>
+      </w:pPr>
+      <w:r>
+        <w:rPr>
+          <w:i w:val="0"/>
+        </w:rPr>
+        <w:t xml:space="preserve">U.S. Government Accountability Office. (2018). </w:t>
+      </w:r>
+      <w:r>
+        <w:rPr>
+          <w:i/>
+        </w:rPr>
+        <w:t>Food insecurity: Better information could help eligible college students access federal food assistance benefits</w:t>
+      </w:r>
+      <w:r>
+        <w:rPr>
+          <w:i w:val="0"/>
+        </w:rPr>
+        <w:t xml:space="preserve"> (GAO-19-95). </w:t>
+      </w:r>
+      <w:hyperlink r:id="rId31">
+        <w:r>
+          <w:rPr>
+            <w:rFonts w:ascii="Times New Roman" w:hAnsi="Times New Roman" w:cs="Times New Roman"/>
+            <w:color w:val="0563C1"/>
+            <w:u w:val="single"/>
+            <w:sz w:val="24"/>
+          </w:rPr>
+          <w:t>https://www.gao.gov/products/gao-19-95</w:t>
+        </w:r>
+      </w:hyperlink>
+    </w:p>
+    <w:p>
+      <w:pPr>
+        <w:spacing w:line="480" w:lineRule="auto" w:after="0"/>
+        <w:ind w:left="720" w:hanging="720"/>
+      </w:pPr>
+      <w:r>
+        <w:rPr>
+          <w:i w:val="0"/>
+        </w:rPr>
         <w:t xml:space="preserve">Virkkunen, J., &amp; Newnham, D. S. (2013). </w:t>
       </w:r>
       <w:r>
@@ -585,7 +913,7 @@
         </w:rPr>
         <w:t xml:space="preserve">. Sense Publishers. </w:t>
       </w:r>
-      <w:hyperlink r:id="rId24">
+      <w:hyperlink r:id="rId32">
         <w:r>
           <w:rPr>
             <w:rFonts w:ascii="Times New Roman" w:hAnsi="Times New Roman" w:cs="Times New Roman"/>
@@ -620,7 +948,7 @@
         </w:rPr>
         <w:t xml:space="preserve">(3), 253–297. </w:t>
       </w:r>
-      <w:hyperlink r:id="rId25">
+      <w:hyperlink r:id="rId33">
         <w:r>
           <w:rPr>
             <w:rFonts w:ascii="Times New Roman" w:hAnsi="Times New Roman" w:cs="Times New Roman"/>
@@ -629,6 +957,41 @@
             <w:sz w:val="24"/>
           </w:rPr>
           <w:t>https://doi.org/10.1257/app.20170430</w:t>
+        </w:r>
+      </w:hyperlink>
+    </w:p>
+    <w:p>
+      <w:pPr>
+        <w:spacing w:line="480" w:lineRule="auto" w:after="0"/>
+        <w:ind w:left="720" w:hanging="720"/>
+      </w:pPr>
+      <w:r>
+        <w:rPr>
+          <w:i w:val="0"/>
+        </w:rPr>
+        <w:t xml:space="preserve">Yosso, T. J. (2005). Whose culture has capital? A critical race theory discussion of community cultural wealth. </w:t>
+      </w:r>
+      <w:r>
+        <w:rPr>
+          <w:i/>
+        </w:rPr>
+        <w:t>Race Ethnicity and Education, 8</w:t>
+      </w:r>
+      <w:r>
+        <w:rPr>
+          <w:i w:val="0"/>
+        </w:rPr>
+        <w:t xml:space="preserve">(1), 69–91. </w:t>
+      </w:r>
+      <w:hyperlink r:id="rId34">
+        <w:r>
+          <w:rPr>
+            <w:rFonts w:ascii="Times New Roman" w:hAnsi="Times New Roman" w:cs="Times New Roman"/>
+            <w:color w:val="0563C1"/>
+            <w:u w:val="single"/>
+            <w:sz w:val="24"/>
+          </w:rPr>
+          <w:t>https://doi.org/10.1080/1361332052000341006</w:t>
         </w:r>
       </w:hyperlink>
     </w:p>

</xml_diff>